<commit_message>
Forged: fem teologiske formuleringer endret etter forfatterens avgjørelse
- Intro: "You are not beyond repair."
- Day 7: "God often steers you through your attention, ..."
- Day 30: "His silence is not neglect. He has not let go of you."
- Day 34: originalens kontrast tilbake ("Witness is not performance. It is presence ...")
- Vedlegg B: "Healing Forge is part of formation"
- Day 34: "Logan said little." (holder antitesegrensen per dag)
- PDF 6x9 og 5x8, EPUB, docx og sporet docx bygget på nytt; begge slop-sperrer 0
- Rapporter oppdatert (redaktørrapport, slop-revisjon, endringslogg, KDP-sjekkliste, beslutningslogg 18-19, formliste)

Co-Authored-By: Claude Opus 5.5 <noreply@anthropic.com>
Claude-Session: https://claude.ai/code/session_01Uj4xJYJFkkoUJCAJUZGjyJ
</commit_message>
<xml_diff>
--- a/Forged/bok/ut/FORGED_manus.docx
+++ b/Forged/bok/ut/FORGED_manus.docx
@@ -238,7 +238,7 @@
         <w:pStyle w:val="BodyText"/>
       </w:pPr>
       <w:r>
-        <w:t xml:space="preserve">You are not broken. But you are being shaped, whether you choose it or not: by habits, reactions, silence, environment, fear, convenience, and unresolved pain. This book exists to interrupt the shaping you never chose.</w:t>
+        <w:t xml:space="preserve">You are not beyond repair. But you are being shaped, whether you choose it or not: by habits, reactions, silence, environment, fear, convenience, and unresolved pain. This book exists to interrupt the shaping you never chose.</w:t>
       </w:r>
     </w:p>
     <w:bookmarkEnd w:id="22"/>
@@ -3321,7 +3321,7 @@
         <w:pStyle w:val="BodyText"/>
       </w:pPr>
       <w:r>
-        <w:t xml:space="preserve">God rarely steers your motion directly. He directs your attention, and where your attention stays, your life follows.</w:t>
+        <w:t xml:space="preserve">God often steers you through your attention, and where your attention stays, your life follows.</w:t>
       </w:r>
     </w:p>
     <w:bookmarkEnd w:id="68"/>
@@ -11958,7 +11958,7 @@
         <w:pStyle w:val="FirstParagraph"/>
       </w:pPr>
       <w:r>
-        <w:t xml:space="preserve">For some men, silence once meant danger: disconnection, withdrawal, being left alone with no explanation. God’s quiet can wake those memories. His silence is not neglect. It is trust. You are being relied upon.</w:t>
+        <w:t xml:space="preserve">For some men, silence once meant danger: disconnection, withdrawal, being left alone with no explanation. God’s quiet can wake those memories. His silence is not neglect. He has not let go of you.</w:t>
       </w:r>
     </w:p>
     <w:p>
@@ -13044,7 +13044,7 @@
         <w:pStyle w:val="FirstParagraph"/>
       </w:pPr>
       <w:r>
-        <w:t xml:space="preserve">Witness is presence that stays the same from one setting to the next. A coherent life persuades more than any argument, and a life that holds together over time is hard to dismiss.</w:t>
+        <w:t xml:space="preserve">Witness is not performance. It is presence that stays the same from one setting to the next. A coherent life persuades more than any argument, and a life that holds together over time is hard to dismiss.</w:t>
       </w:r>
     </w:p>
     <w:bookmarkStart w:id="232" w:name="the-scenario-33"/>
@@ -13061,7 +13061,7 @@
         <w:pStyle w:val="FirstParagraph"/>
       </w:pPr>
       <w:r>
-        <w:t xml:space="preserve">Logan did not say much. He did not start debates, post his convictions, or correct people quickly. But his direction held: the same tone at work and at home, the same restraint under pressure, the same decisions whether anyone noticed or not.</w:t>
+        <w:t xml:space="preserve">Logan said little. He did not start debates, post his convictions, or correct people quickly. But his direction held: the same tone at work and at home, the same restraint under pressure, the same decisions whether anyone noticed or not.</w:t>
       </w:r>
     </w:p>
     <w:p>
@@ -15960,7 +15960,7 @@
         <w:pStyle w:val="BodyText"/>
       </w:pPr>
       <w:r>
-        <w:t xml:space="preserve">Healing restores clarity. Clarity strengthens discipline. Discipline then becomes livable. That is why Healing Forge is the foundation of formation and no detour from it.</w:t>
+        <w:t xml:space="preserve">Healing restores clarity. Clarity strengthens discipline. Discipline then becomes livable. That is why Healing Forge is part of formation and no detour from it.</w:t>
       </w:r>
     </w:p>
     <w:p>

</xml_diff>

<commit_message>
Forged: sideskift direkte på dag- og kapitteloverskrifter i Word-manuset
Programmer som ignorerer sideskift arvet fra stilen (blant annet Google Docs)
starter nå også hver dag og hvert kapittel på ny side. Kontrollert i LibreOffice:
106 sider, 40 av 40 dager øverst på ny side, ingen tomme sider.

Co-Authored-By: Claude Opus 5.5 <noreply@anthropic.com>
Claude-Session: https://claude.ai/code/session_01Uj4xJYJFkkoUJCAJUZGjyJ
</commit_message>
<xml_diff>
--- a/Forged/bok/ut/FORGED_manus.docx
+++ b/Forged/bok/ut/FORGED_manus.docx
@@ -90,6 +90,7 @@
     <w:p>
       <w:pPr>
         <w:pStyle w:val="Heading1"/>
+        <w:pageBreakBefore/>
       </w:pPr>
       <w:r>
         <w:t xml:space="preserve">To the One Giving This Book</w:t>
@@ -116,6 +117,7 @@
     <w:p>
       <w:pPr>
         <w:pStyle w:val="Heading1"/>
+        <w:pageBreakBefore/>
       </w:pPr>
       <w:r>
         <w:t xml:space="preserve">Foreword</w:t>
@@ -231,6 +233,7 @@
     <w:p>
       <w:pPr>
         <w:pStyle w:val="Heading1"/>
+        <w:pageBreakBefore/>
       </w:pPr>
       <w:r>
         <w:t xml:space="preserve">Introduction</w:t>
@@ -638,6 +641,7 @@
     <w:p>
       <w:pPr>
         <w:pStyle w:val="Heading1"/>
+        <w:pageBreakBefore/>
       </w:pPr>
       <w:r>
         <w:t xml:space="preserve">Phase I: Flare</w:t>
@@ -655,6 +659,7 @@
     <w:p>
       <w:pPr>
         <w:pStyle w:val="Heading2"/>
+        <w:pageBreakBefore/>
       </w:pPr>
       <w:r>
         <w:t xml:space="preserve">Day 1: Kindling the Flame</w:t>
@@ -1029,6 +1034,7 @@
     <w:p>
       <w:pPr>
         <w:pStyle w:val="Heading2"/>
+        <w:pageBreakBefore/>
       </w:pPr>
       <w:r>
         <w:t xml:space="preserve">Day 2: Separation Without Rejection</w:t>
@@ -1431,6 +1437,7 @@
     <w:p>
       <w:pPr>
         <w:pStyle w:val="Heading2"/>
+        <w:pageBreakBefore/>
       </w:pPr>
       <w:r>
         <w:t xml:space="preserve">Day 3: Questions That Refine</w:t>
@@ -1777,6 +1784,7 @@
     <w:p>
       <w:pPr>
         <w:pStyle w:val="Heading2"/>
+        <w:pageBreakBefore/>
       </w:pPr>
       <w:r>
         <w:t xml:space="preserve">Day 4: Purpose Behind the Rules</w:t>
@@ -2111,6 +2119,7 @@
     <w:p>
       <w:pPr>
         <w:pStyle w:val="Heading2"/>
+        <w:pageBreakBefore/>
       </w:pPr>
       <w:r>
         <w:t xml:space="preserve">Day 5: Holy Discontent</w:t>
@@ -2445,6 +2454,7 @@
     <w:p>
       <w:pPr>
         <w:pStyle w:val="Heading2"/>
+        <w:pageBreakBefore/>
       </w:pPr>
       <w:r>
         <w:t xml:space="preserve">Day 6: Strength as Assignment</w:t>
@@ -2847,6 +2857,7 @@
     <w:p>
       <w:pPr>
         <w:pStyle w:val="Heading2"/>
+        <w:pageBreakBefore/>
       </w:pPr>
       <w:r>
         <w:t xml:space="preserve">Day 7: Oriented Living</w:t>
@@ -3153,6 +3164,7 @@
     <w:p>
       <w:pPr>
         <w:pStyle w:val="Heading2"/>
+        <w:pageBreakBefore/>
       </w:pPr>
       <w:r>
         <w:t xml:space="preserve">Day 8: Passion as Signal</w:t>
@@ -3488,6 +3500,7 @@
     <w:p>
       <w:pPr>
         <w:pStyle w:val="Heading1"/>
+        <w:pageBreakBefore/>
       </w:pPr>
       <w:r>
         <w:t xml:space="preserve">Phase II: Observe</w:t>
@@ -3505,6 +3518,7 @@
     <w:p>
       <w:pPr>
         <w:pStyle w:val="Heading2"/>
+        <w:pageBreakBefore/>
       </w:pPr>
       <w:r>
         <w:t xml:space="preserve">Day 9: Faith Under Test</w:t>
@@ -3887,6 +3901,7 @@
     <w:p>
       <w:pPr>
         <w:pStyle w:val="Heading2"/>
+        <w:pageBreakBefore/>
       </w:pPr>
       <w:r>
         <w:t xml:space="preserve">Day 10: Your Digital Habitat</w:t>
@@ -4221,6 +4236,7 @@
     <w:p>
       <w:pPr>
         <w:pStyle w:val="Heading2"/>
+        <w:pageBreakBefore/>
       </w:pPr>
       <w:r>
         <w:t xml:space="preserve">Day 11: Thinking Under Pressure</w:t>
@@ -4611,6 +4627,7 @@
     <w:p>
       <w:pPr>
         <w:pStyle w:val="Heading2"/>
+        <w:pageBreakBefore/>
       </w:pPr>
       <w:r>
         <w:t xml:space="preserve">Day 12: When Standing Out Costs You</w:t>
@@ -4945,6 +4962,7 @@
     <w:p>
       <w:pPr>
         <w:pStyle w:val="Heading2"/>
+        <w:pageBreakBefore/>
       </w:pPr>
       <w:r>
         <w:t xml:space="preserve">Day 13: When Attachment Pulls You Off Course</w:t>
@@ -5287,6 +5305,7 @@
     <w:p>
       <w:pPr>
         <w:pStyle w:val="Heading2"/>
+        <w:pageBreakBefore/>
       </w:pPr>
       <w:r>
         <w:t xml:space="preserve">Day 14: What Money Really Directs</w:t>
@@ -5621,6 +5640,7 @@
     <w:p>
       <w:pPr>
         <w:pStyle w:val="Heading2"/>
+        <w:pageBreakBefore/>
       </w:pPr>
       <w:r>
         <w:t xml:space="preserve">Day 15: When Anger Has a History</w:t>
@@ -5955,6 +5975,7 @@
     <w:p>
       <w:pPr>
         <w:pStyle w:val="Heading2"/>
+        <w:pageBreakBefore/>
       </w:pPr>
       <w:r>
         <w:t xml:space="preserve">Day 16: Who You Are When No One Sees</w:t>
@@ -6290,6 +6311,7 @@
     <w:p>
       <w:pPr>
         <w:pStyle w:val="Heading1"/>
+        <w:pageBreakBefore/>
       </w:pPr>
       <w:r>
         <w:t xml:space="preserve">Phase III: Refine</w:t>
@@ -6307,6 +6329,7 @@
     <w:p>
       <w:pPr>
         <w:pStyle w:val="Heading2"/>
+        <w:pageBreakBefore/>
       </w:pPr>
       <w:r>
         <w:t xml:space="preserve">Day 17: Faith That Moves</w:t>
@@ -6649,6 +6672,7 @@
     <w:p>
       <w:pPr>
         <w:pStyle w:val="Heading2"/>
+        <w:pageBreakBefore/>
       </w:pPr>
       <w:r>
         <w:t xml:space="preserve">Day 18: Failure as Forging</w:t>
@@ -6983,6 +7007,7 @@
     <w:p>
       <w:pPr>
         <w:pStyle w:val="Heading2"/>
+        <w:pageBreakBefore/>
       </w:pPr>
       <w:r>
         <w:t xml:space="preserve">Day 19: Scripture as a Mirror</w:t>
@@ -7317,6 +7342,7 @@
     <w:p>
       <w:pPr>
         <w:pStyle w:val="Heading2"/>
+        <w:pageBreakBefore/>
       </w:pPr>
       <w:r>
         <w:t xml:space="preserve">Day 20: Strength Grows in Brotherhood</w:t>
@@ -7651,6 +7677,7 @@
     <w:p>
       <w:pPr>
         <w:pStyle w:val="Heading2"/>
+        <w:pageBreakBefore/>
       </w:pPr>
       <w:r>
         <w:t xml:space="preserve">Day 21: The Battle You Don’t Announce</w:t>
@@ -7985,6 +8012,7 @@
     <w:p>
       <w:pPr>
         <w:pStyle w:val="Heading2"/>
+        <w:pageBreakBefore/>
       </w:pPr>
       <w:r>
         <w:t xml:space="preserve">Day 22: Wisdom Beyond Rules</w:t>
@@ -8319,6 +8347,7 @@
     <w:p>
       <w:pPr>
         <w:pStyle w:val="Heading2"/>
+        <w:pageBreakBefore/>
       </w:pPr>
       <w:r>
         <w:t xml:space="preserve">Day 23: Knowledge That Works</w:t>
@@ -8653,6 +8682,7 @@
     <w:p>
       <w:pPr>
         <w:pStyle w:val="Heading2"/>
+        <w:pageBreakBefore/>
       </w:pPr>
       <w:r>
         <w:t xml:space="preserve">Day 24: Strength Integrated</w:t>
@@ -8988,6 +9018,7 @@
     <w:p>
       <w:pPr>
         <w:pStyle w:val="Heading1"/>
+        <w:pageBreakBefore/>
       </w:pPr>
       <w:r>
         <w:t xml:space="preserve">Phase IV: Grit</w:t>
@@ -9005,6 +9036,7 @@
     <w:p>
       <w:pPr>
         <w:pStyle w:val="Heading2"/>
+        <w:pageBreakBefore/>
       </w:pPr>
       <w:r>
         <w:t xml:space="preserve">Day 25: The Edge of Discipline</w:t>
@@ -9339,6 +9371,7 @@
     <w:p>
       <w:pPr>
         <w:pStyle w:val="Heading2"/>
+        <w:pageBreakBefore/>
       </w:pPr>
       <w:r>
         <w:t xml:space="preserve">Day 26: The Morning You Don’t Feel Like Facing</w:t>
@@ -9637,6 +9670,7 @@
     <w:p>
       <w:pPr>
         <w:pStyle w:val="Heading2"/>
+        <w:pageBreakBefore/>
       </w:pPr>
       <w:r>
         <w:t xml:space="preserve">Day 27: Staying Awake on Purpose</w:t>
@@ -9935,6 +9969,7 @@
     <w:p>
       <w:pPr>
         <w:pStyle w:val="Heading2"/>
+        <w:pageBreakBefore/>
       </w:pPr>
       <w:r>
         <w:t xml:space="preserve">Day 28: Discipline in a Designed World</w:t>
@@ -10233,6 +10268,7 @@
     <w:p>
       <w:pPr>
         <w:pStyle w:val="Heading2"/>
+        <w:pageBreakBefore/>
       </w:pPr>
       <w:r>
         <w:t xml:space="preserve">Day 29: Prepared for Pressure</w:t>
@@ -10531,6 +10567,7 @@
     <w:p>
       <w:pPr>
         <w:pStyle w:val="Heading2"/>
+        <w:pageBreakBefore/>
       </w:pPr>
       <w:r>
         <w:t xml:space="preserve">Day 30: When God Feels Distant</w:t>
@@ -10829,6 +10866,7 @@
     <w:p>
       <w:pPr>
         <w:pStyle w:val="Heading2"/>
+        <w:pageBreakBefore/>
       </w:pPr>
       <w:r>
         <w:t xml:space="preserve">Day 31: The Body as an Instrument</w:t>
@@ -11127,6 +11165,7 @@
     <w:p>
       <w:pPr>
         <w:pStyle w:val="Heading2"/>
+        <w:pageBreakBefore/>
       </w:pPr>
       <w:r>
         <w:t xml:space="preserve">Day 32: The Discipline of Finishing</w:t>
@@ -11426,6 +11465,7 @@
     <w:p>
       <w:pPr>
         <w:pStyle w:val="Heading1"/>
+        <w:pageBreakBefore/>
       </w:pPr>
       <w:r>
         <w:t xml:space="preserve">Phase V: Elevate</w:t>
@@ -11443,6 +11483,7 @@
     <w:p>
       <w:pPr>
         <w:pStyle w:val="Heading2"/>
+        <w:pageBreakBefore/>
       </w:pPr>
       <w:r>
         <w:t xml:space="preserve">Day 33: Strength That Serves</w:t>
@@ -11741,6 +11782,7 @@
     <w:p>
       <w:pPr>
         <w:pStyle w:val="Heading2"/>
+        <w:pageBreakBefore/>
       </w:pPr>
       <w:r>
         <w:t xml:space="preserve">Day 34: A Credible Witness</w:t>
@@ -12039,6 +12081,7 @@
     <w:p>
       <w:pPr>
         <w:pStyle w:val="Heading2"/>
+        <w:pageBreakBefore/>
       </w:pPr>
       <w:r>
         <w:t xml:space="preserve">Day 35: Quiet Influence</w:t>
@@ -12337,6 +12380,7 @@
     <w:p>
       <w:pPr>
         <w:pStyle w:val="Heading2"/>
+        <w:pageBreakBefore/>
       </w:pPr>
       <w:r>
         <w:t xml:space="preserve">Day 36: Speaking with Precision</w:t>
@@ -12635,6 +12679,7 @@
     <w:p>
       <w:pPr>
         <w:pStyle w:val="Heading2"/>
+        <w:pageBreakBefore/>
       </w:pPr>
       <w:r>
         <w:t xml:space="preserve">Day 37: Living with Eternity in View</w:t>
@@ -12933,6 +12978,7 @@
     <w:p>
       <w:pPr>
         <w:pStyle w:val="Heading2"/>
+        <w:pageBreakBefore/>
       </w:pPr>
       <w:r>
         <w:t xml:space="preserve">Day 38: When Strength Is Finally Visible</w:t>
@@ -13231,6 +13277,7 @@
     <w:p>
       <w:pPr>
         <w:pStyle w:val="Heading2"/>
+        <w:pageBreakBefore/>
       </w:pPr>
       <w:r>
         <w:t xml:space="preserve">Day 39: When Authority Is Quiet</w:t>
@@ -13529,6 +13576,7 @@
     <w:p>
       <w:pPr>
         <w:pStyle w:val="Heading2"/>
+        <w:pageBreakBefore/>
       </w:pPr>
       <w:r>
         <w:t xml:space="preserve">Day 40: Living Forward</w:t>
@@ -13860,6 +13908,7 @@
     <w:p>
       <w:pPr>
         <w:pStyle w:val="Heading1"/>
+        <w:pageBreakBefore/>
       </w:pPr>
       <w:r>
         <w:t xml:space="preserve">Conclusion: What You Carry Forward</w:t>
@@ -14142,6 +14191,7 @@
     <w:p>
       <w:pPr>
         <w:pStyle w:val="Heading1"/>
+        <w:pageBreakBefore/>
       </w:pPr>
       <w:r>
         <w:t xml:space="preserve">Appendix A: The FORGE Cycle</w:t>
@@ -14302,6 +14352,7 @@
     <w:p>
       <w:pPr>
         <w:pStyle w:val="Heading1"/>
+        <w:pageBreakBefore/>
       </w:pPr>
       <w:r>
         <w:t xml:space="preserve">Appendix B: Healing Forge</w:t>
@@ -14432,6 +14483,7 @@
     <w:p>
       <w:pPr>
         <w:pStyle w:val="Heading1"/>
+        <w:pageBreakBefore/>
       </w:pPr>
       <w:r>
         <w:t xml:space="preserve">Appendix C: How to Continue After Day 40</w:t>
@@ -14672,6 +14724,7 @@
     <w:p>
       <w:pPr>
         <w:pStyle w:val="Heading1"/>
+        <w:pageBreakBefore/>
       </w:pPr>
       <w:r>
         <w:t xml:space="preserve">About the Author</w:t>

</xml_diff>

<commit_message>
Forged: ChatGPT-kvalitetssikringen vurdert; ti språkrettelser lagt inn
- 34 funn kontrollert (alle sitater ordrett i manus) og vurdert av to uavhengige
  lesere mot forfatterens originaltekst
- Lagt inn: Day 1, 4, 9, 15, 18 (2), 27, 29, 30, 32 og to titler (With)
- 12 funn lagt fram for forfatteren, 12 avvist med begrunnelse (14-chatgpt-funn-vurdert.md)
- PDF 6x9/5x8, EPUB, Word, Markdown og RTF bygget på nytt; sperrer 0, innhold 50/50

Co-Authored-By: Claude Opus 5.5 <noreply@anthropic.com>
Claude-Session: https://claude.ai/code/session_01Uj4xJYJFkkoUJCAJUZGjyJ
</commit_message>
<xml_diff>
--- a/Forged/bok/ut/FORGED_manus.docx
+++ b/Forged/bok/ut/FORGED_manus.docx
@@ -727,7 +727,7 @@
         <w:pStyle w:val="BodyText"/>
       </w:pPr>
       <w:r>
-        <w:t xml:space="preserve">Lying in the hospital bed, he faced something he had never been forced to face: he did not know whether what he believed would hold if he died that night. He had beliefs, and he knew the words. What he did not have was certainty that pressure had tested.</w:t>
+        <w:t xml:space="preserve">Lying in the hospital bed, he faced something he had never been forced to face: he did not know whether what he believed would hold if he died that night. He had beliefs, and he knew the words. What he did not have was certainty that had been tested under pressure.</w:t>
       </w:r>
     </w:p>
     <w:p>
@@ -1836,7 +1836,7 @@
         <w:pStyle w:val="BodyText"/>
       </w:pPr>
       <w:r>
-        <w:t xml:space="preserve">Over time something shifted. The rules he bent without anyone noticing started to bend him. The change came from slow wear and tear, not from guilt. He noticed it in small ways. Discipline became optional, his commitments came with conditions, and he did the right thing only when it suited him. Nothing dramatic happened. The direction of his life just got weaker.</w:t>
+        <w:t xml:space="preserve">Over time something shifted. The rules he bent without anyone noticing started to bend him. The change came from slow wear and tear, not from guilt. He noticed it in small ways. Discipline became optional, his commitments came with conditions, and he did the right thing only when it suited him. Nothing dramatic happened. He just drifted off course.</w:t>
       </w:r>
     </w:p>
     <w:bookmarkEnd w:id="48"/>
@@ -3804,7 +3804,7 @@
         <w:pStyle w:val="FirstParagraph"/>
       </w:pPr>
       <w:r>
-        <w:t xml:space="preserve">These moments show what has been built in you more honestly than your good intentions ever will. God tests you to make you a man who can be counted on. He is not testing you to show how weak you are.</w:t>
+        <w:t xml:space="preserve">These moments show what has been built in you more honestly than your good intentions ever will. God tests you to make you a man who can be counted on. He is not testing you to prove you are not good enough.</w:t>
       </w:r>
     </w:p>
     <w:bookmarkEnd w:id="81"/>
@@ -5667,7 +5667,7 @@
         <w:pStyle w:val="FirstParagraph"/>
       </w:pPr>
       <w:r>
-        <w:t xml:space="preserve">Anger is rarely about the moment that sets it off. It carries the past with it. What blows up fast was usually stored up for a long time.</w:t>
+        <w:t xml:space="preserve">Anger is rarely about the moment that sets it off. It carries the past with it. What blows up fast was often stored up for a long time.</w:t>
       </w:r>
     </w:p>
     <w:bookmarkStart w:id="115" w:name="the-scenario-14"/>
@@ -6884,7 +6884,7 @@
         <w:pStyle w:val="BodyText"/>
       </w:pPr>
       <w:r>
-        <w:t xml:space="preserve">Failure only disqualifies you if you never ask what it means.</w:t>
+        <w:t xml:space="preserve">Failure only disqualifies you from growing if you never ask what it means.</w:t>
       </w:r>
     </w:p>
     <w:bookmarkEnd w:id="135"/>
@@ -6902,7 +6902,7 @@
         <w:pStyle w:val="FirstParagraph"/>
       </w:pPr>
       <w:r>
-        <w:t xml:space="preserve">After you fall, keep training. There is nothing glorious about failure, and you would rather learn from someone else’s fall. But the lesson you need is in your own. Failure is feedback, and every breakdown shows where you counted on a strength you had never trained.</w:t>
+        <w:t xml:space="preserve">After you fall, keep training. There is nothing glorious about failure, and you would rather learn from someone else’s fall. But the lesson you need is in your own. Failure is feedback. Every time your effort falls apart, it shows where you counted on a strength you had never trained.</w:t>
       </w:r>
     </w:p>
     <w:p>
@@ -9952,7 +9952,7 @@
         <w:pStyle w:val="FirstParagraph"/>
       </w:pPr>
       <w:r>
-        <w:t xml:space="preserve">If you learned to scan for danger and never rest, because you could never tell what was coming, that restlessness was how you survived. The alertness asked of you here is calm and rests on trust. What you are guarding is your direction. You can stop bracing for everything to fall apart.</w:t>
+        <w:t xml:space="preserve">If you learned to scan for danger and never rest, because you could never tell what was coming, that restlessness was how you survived. The alertness asked of you here is calm and rests on trust. What you are guarding is your direction. You are not asked to brace for everything to fall apart.</w:t>
       </w:r>
     </w:p>
     <w:p>
@@ -10550,7 +10550,7 @@
         <w:pStyle w:val="FirstParagraph"/>
       </w:pPr>
       <w:r>
-        <w:t xml:space="preserve">If pressure once meant danger (raised voices, punishment, not being safe), being ready can feel like being on guard all the time. The readiness you are training for is calm and anchored. You are learning to stay in the moment when the weight comes on, and you can stop bracing for harm.</w:t>
+        <w:t xml:space="preserve">If pressure once meant danger (raised voices, punishment, not being safe), being ready can feel like being on guard all the time. The readiness you are training for is calm and anchored. You are learning to stay in the moment when the weight comes on, instead of bracing for harm.</w:t>
       </w:r>
     </w:p>
     <w:p>
@@ -10779,7 +10779,7 @@
         <w:pStyle w:val="BodyText"/>
       </w:pPr>
       <w:r>
-        <w:t xml:space="preserve">Often, silence means comfort is being held back.</w:t>
+        <w:t xml:space="preserve">Often, silence means reassurance is being held back.</w:t>
       </w:r>
     </w:p>
     <w:bookmarkEnd w:id="208"/>
@@ -10797,7 +10797,7 @@
         <w:pStyle w:val="FirstParagraph"/>
       </w:pPr>
       <w:r>
-        <w:t xml:space="preserve">Today is about staying faithful while that comfort is held back, whether or not the feelings come back. Sooner or later, your growth stops running on excitement and starts running on commitment. Early on, God often feels close because your faith is still being built. Later, your faith holds because you have chosen it.</w:t>
+        <w:t xml:space="preserve">Today is about staying faithful while that reassurance is held back, whether or not the feelings come back. Sooner or later, your growth stops running on excitement and starts running on commitment. Early on, God often feels close because your faith is still being built. Later, your faith holds because you have chosen it.</w:t>
       </w:r>
     </w:p>
     <w:p>
@@ -11447,7 +11447,7 @@
         <w:pStyle w:val="FirstParagraph"/>
       </w:pPr>
       <w:r>
-        <w:t xml:space="preserve">Endings may have brought you pain: people leaving, fights, closeness taken away. Stopping early felt safer than risking disappointment at the end. Finishing what you started brings things together, and no one gets abandoned in it. You are allowed to close what you no longer need to carry.</w:t>
+        <w:t xml:space="preserve">Endings may have brought you pain: people leaving, fights, closeness taken away. Stopping early felt safer than risking disappointment at the end. Finishing what you started brings things together. Finishing is not abandonment. You are allowed to close what you no longer need to carry.</w:t>
       </w:r>
     </w:p>
     <w:p>
@@ -12383,7 +12383,7 @@
         <w:pageBreakBefore/>
       </w:pPr>
       <w:r>
-        <w:t xml:space="preserve">Day 36: Speaking with Precision</w:t>
+        <w:t xml:space="preserve">Day 36: Speaking With Precision</w:t>
       </w:r>
     </w:p>
     <w:p>
@@ -12682,7 +12682,7 @@
         <w:pageBreakBefore/>
       </w:pPr>
       <w:r>
-        <w:t xml:space="preserve">Day 37: Living with Eternity in View</w:t>
+        <w:t xml:space="preserve">Day 37: Living With Eternity in View</w:t>
       </w:r>
     </w:p>
     <w:p>

</xml_diff>

<commit_message>
Forged: forfatterens avgjørelser på ChatGPT-funnene lagt inn (følg anbefalingene)
- Appendix A: «efficient hypocrite» erstattet; Day 38 HF: «often», «may be»
- Day 15: «not always the problem»; «Understanding your anger helps you control it.»
- Day 19: «Do not rush to analyze it or point it at someone else.»
- Introduksjonen: linje om akutt hjelp; «have not trained it»
- Day 26 HF: henvisning ved vedvarende tyngde; Day 5: «God's correction»
- Day 30 Practice: «Do not chase anything new today»
- Appendix C (funn 2) og Day 12 (funn 34) beholdt
PDF 6x9/5x8, EPUB, Word, Markdown og RTF bygget på nytt; sperrer 0, innhold 50/50.

Co-Authored-By: Claude Opus 5.5 <noreply@anthropic.com>
Claude-Session: https://claude.ai/code/session_01Uj4xJYJFkkoUJCAJUZGjyJ
</commit_message>
<xml_diff>
--- a/Forged/bok/ut/FORGED_manus.docx
+++ b/Forged/bok/ut/FORGED_manus.docx
@@ -303,7 +303,7 @@
         <w:pStyle w:val="BodyText"/>
       </w:pPr>
       <w:r>
-        <w:t xml:space="preserve">Young men rarely fail because they think their faith is wrong. They fail because they never trained it. Pressure does not ask what you believe. It shows what you have practiced.</w:t>
+        <w:t xml:space="preserve">Young men rarely fail because they think their faith is wrong. They fail because they have not trained it. Pressure does not ask what you believe. It shows what you have practiced.</w:t>
       </w:r>
     </w:p>
     <w:p>
@@ -598,7 +598,7 @@
         <w:pStyle w:val="BodyText"/>
       </w:pPr>
       <w:r>
-        <w:t xml:space="preserve">This book is not a counselor. If you carry deep trauma, harm done to you, grief that will not let up, or thoughts that frighten you, go to a pastor, a doctor, or a licensed counselor. Going is part of the training: the same honesty this book asks of you everywhere else, brought to the right place.</w:t>
+        <w:t xml:space="preserve">This book is not a counselor. If you carry deep trauma, harm done to you, grief that will not let up, or thoughts that frighten you, go to a pastor, a doctor, or a licensed counselor. Going is part of the training: the same honesty this book asks of you everywhere else, brought to the right place. If you might hurt yourself or someone else, get emergency help now.</w:t>
       </w:r>
     </w:p>
     <w:bookmarkEnd w:id="27"/>
@@ -2437,7 +2437,7 @@
         <w:pStyle w:val="FirstParagraph"/>
       </w:pPr>
       <w:r>
-        <w:t xml:space="preserve">In some men, discontent quickly turns into blaming themselves. Instead of helping them change, it feeds shame. Feeling convicted shows you what to change. Feeling condemned only wears you down. Holy discontent makes your path clearer without attacking your worth. If your discomfort is leading you to despise yourself, something has twisted it. Bring it back to what is true.</w:t>
+        <w:t xml:space="preserve">In some men, discontent quickly turns into blaming themselves. Instead of helping them change, it feeds shame. God’s correction shows you what to change. Feeling condemned only wears you down. Holy discontent makes your path clearer without attacking your worth. If your discomfort is leading you to despise yourself, something has twisted it. Bring it back to what is true.</w:t>
       </w:r>
     </w:p>
     <w:p>
@@ -5852,7 +5852,7 @@
         <w:pStyle w:val="BodyText"/>
       </w:pPr>
       <w:r>
-        <w:t xml:space="preserve">Anger itself is not the problem. Anger you never look at is.</w:t>
+        <w:t xml:space="preserve">Anger itself is not always the problem. Anger you never look at is.</w:t>
       </w:r>
     </w:p>
     <w:bookmarkEnd w:id="116"/>
@@ -5940,7 +5940,7 @@
         <w:pStyle w:val="FirstParagraph"/>
       </w:pPr>
       <w:r>
-        <w:t xml:space="preserve">Write the answers down where only you will see them. Understanding comes before self-control.</w:t>
+        <w:t xml:space="preserve">Write the answers down where only you will see them. Understanding your anger helps you control it.</w:t>
       </w:r>
     </w:p>
     <w:bookmarkEnd w:id="118"/>
@@ -7307,7 +7307,7 @@
         <w:pStyle w:val="FirstParagraph"/>
       </w:pPr>
       <w:r>
-        <w:t xml:space="preserve">Do not rush to work out what it means. Let it show you yourself first.</w:t>
+        <w:t xml:space="preserve">Do not rush to analyze it or point it at someone else. Let it show you yourself first.</w:t>
       </w:r>
     </w:p>
     <w:bookmarkEnd w:id="143"/>
@@ -9653,7 +9653,7 @@
         <w:pStyle w:val="FirstParagraph"/>
       </w:pPr>
       <w:r>
-        <w:t xml:space="preserve">Mornings may once have filled you with dread: conflict, demands, responsibility with no one to help you carry it. Avoiding them protected you. Healing invites you back gently, and you do not have to be perfect. Showing up can be quiet. What counts is that you choose it.</w:t>
+        <w:t xml:space="preserve">Mornings may once have filled you with dread: conflict, demands, responsibility with no one to help you carry it. Avoiding them protected you. Healing invites you back gently, and you do not have to be perfect. Showing up can be quiet. What counts is that you choose it. If the heaviness will not let up, talk to a pastor, a doctor, or a licensed counselor.</w:t>
       </w:r>
     </w:p>
     <w:p>
@@ -10823,7 +10823,7 @@
         <w:pStyle w:val="FirstParagraph"/>
       </w:pPr>
       <w:r>
-        <w:t xml:space="preserve">Do not look for anything new today: no new message, no signs, no fresh reassurance. Do what you already know is right. Keep showing up, and stay faithful.</w:t>
+        <w:t xml:space="preserve">Do not chase anything new today: no new message, no signs, no fresh reassurance. Do what you already know is right. Keep showing up, and stay faithful.</w:t>
       </w:r>
     </w:p>
     <w:p>
@@ -13260,7 +13260,7 @@
         <w:pStyle w:val="FirstParagraph"/>
       </w:pPr>
       <w:r>
-        <w:t xml:space="preserve">Other people’s attention feels dangerous if it used to mean being watched closely, pressure to measure up, or punishment dressed up as praise. So you learned to disappear. When people notice you because you have grown, that is a kind of trust. They are leaning on you, not watching to catch your mistakes.</w:t>
+        <w:t xml:space="preserve">Other people’s attention feels dangerous if it used to mean being watched closely, pressure to measure up, or punishment dressed up as praise. So you learned to disappear. When people notice you because you have grown, that is often a kind of trust. They may be leaning on you, not watching to catch your mistakes.</w:t>
       </w:r>
     </w:p>
     <w:p>
@@ -14238,7 +14238,7 @@
         <w:pStyle w:val="BodyText"/>
       </w:pPr>
       <w:r>
-        <w:t xml:space="preserve">If you practice the habits but skip the healing, you end up an efficient hypocrite: better organized, but still not whole. None of this means you make yourself holy. Scripture says that God Himself makes you holy (1 Thessalonians 5:23). The cycle describes your part in His work and never replaces it.</w:t>
+        <w:t xml:space="preserve">If you practice the habits but skip the healing, you end up better organized on the outside and still not whole inside. None of this means you make yourself holy. Scripture says that God Himself makes you holy (1 Thessalonians 5:23). The cycle describes your part in His work and never replaces it.</w:t>
       </w:r>
     </w:p>
     <w:p>

</xml_diff>

<commit_message>
Forged: etterkontroll av endrede setninger; fem små rettelser
Day 30, 18, 38, 15 og 5: gjentakelser og løse henvisninger rettet etter uavhengig
lesning i sammenheng. Alle formater bygget på nytt; sperrer 0, innhold 50/50,
RTF lik manus ord for ord med alle 40 dager på ny side.

Co-Authored-By: Claude Opus 5.5 <noreply@anthropic.com>
Claude-Session: https://claude.ai/code/session_01Uj4xJYJFkkoUJCAJUZGjyJ
</commit_message>
<xml_diff>
--- a/Forged/bok/ut/FORGED_manus.docx
+++ b/Forged/bok/ut/FORGED_manus.docx
@@ -2437,7 +2437,7 @@
         <w:pStyle w:val="FirstParagraph"/>
       </w:pPr>
       <w:r>
-        <w:t xml:space="preserve">In some men, discontent quickly turns into blaming themselves. Instead of helping them change, it feeds shame. God’s correction shows you what to change. Feeling condemned only wears you down. Holy discontent makes your path clearer without attacking your worth. If your discomfort is leading you to despise yourself, something has twisted it. Bring it back to what is true.</w:t>
+        <w:t xml:space="preserve">In some men, discontent quickly turns into blaming themselves. Instead of helping them change, it feeds shame. God’s correction shows you what to work on. Feeling condemned only wears you down. Holy discontent makes your path clearer without attacking your worth. If your discomfort is leading you to despise yourself, something has twisted it. Bring it back to what is true.</w:t>
       </w:r>
     </w:p>
     <w:p>
@@ -5852,7 +5852,7 @@
         <w:pStyle w:val="BodyText"/>
       </w:pPr>
       <w:r>
-        <w:t xml:space="preserve">Anger itself is not always the problem. Anger you never look at is.</w:t>
+        <w:t xml:space="preserve">Anger itself is not always the problem. Never looking at it is.</w:t>
       </w:r>
     </w:p>
     <w:bookmarkEnd w:id="116"/>
@@ -6902,7 +6902,7 @@
         <w:pStyle w:val="FirstParagraph"/>
       </w:pPr>
       <w:r>
-        <w:t xml:space="preserve">After you fall, keep training. There is nothing glorious about failure, and you would rather learn from someone else’s fall. But the lesson you need is in your own. Failure is feedback. Every time your effort falls apart, it shows where you counted on a strength you had never trained.</w:t>
+        <w:t xml:space="preserve">After you fall, keep training. There is nothing glorious about failure, and you would rather learn from someone else’s fall. But the lesson you need is in your own. Failure is feedback. Each failure shows where you counted on a strength you had never trained.</w:t>
       </w:r>
     </w:p>
     <w:p>
@@ -10797,7 +10797,7 @@
         <w:pStyle w:val="FirstParagraph"/>
       </w:pPr>
       <w:r>
-        <w:t xml:space="preserve">Today is about staying faithful while that reassurance is held back, whether or not the feelings come back. Sooner or later, your growth stops running on excitement and starts running on commitment. Early on, God often feels close because your faith is still being built. Later, your faith holds because you have chosen it.</w:t>
+        <w:t xml:space="preserve">Today is about staying faithful without that reassurance, whether or not the feelings return. Sooner or later, your growth stops running on excitement and starts running on commitment. Early on, God often feels close because your faith is still being built. Later, your faith holds because you have chosen it.</w:t>
       </w:r>
     </w:p>
     <w:p>
@@ -13260,7 +13260,7 @@
         <w:pStyle w:val="FirstParagraph"/>
       </w:pPr>
       <w:r>
-        <w:t xml:space="preserve">Other people’s attention feels dangerous if it used to mean being watched closely, pressure to measure up, or punishment dressed up as praise. So you learned to disappear. When people notice you because you have grown, that is often a kind of trust. They may be leaning on you, not watching to catch your mistakes.</w:t>
+        <w:t xml:space="preserve">Other people’s attention feels dangerous if it used to mean being watched closely, pressure to measure up, or punishment dressed up as praise. So you learned to disappear. When people notice your growth, that is often a kind of trust. They may be leaning on you, not watching to catch your mistakes.</w:t>
       </w:r>
     </w:p>
     <w:p>

</xml_diff>